<commit_message>
S08: capturas de evidencia en el informe
Capturas de pantalla completa del notebook S08 (reloj y perfil
visibles) insertadas en el DOCX, y el HTML del notebook usado
para tomarlas.

Co-Authored-By: Claude Opus 5.5 <noreply@anthropic.com>
</commit_message>
<xml_diff>
--- a/S08_EquipoLLSW3_GarciaChuraHenyelrey.docx
+++ b/S08_EquipoLLSW3_GarciaChuraHenyelrey.docx
@@ -62,7 +62,7 @@
       <w:pPr>
         <w:pStyle w:val="Ttulo1"/>
       </w:pPr>
-      <w:bookmarkStart w:id="0" w:name="_Toc242893051"/>
+      <w:bookmarkStart w:id="0" w:name="_Toc242895047"/>
       <w:r>
         <w:t>Datos del estudiante</w:t>
       </w:r>
@@ -527,7 +527,7 @@
     <w:sdt>
       <w:sdtPr>
         <w:alias w:val="Contenido"/>
-        <w:id w:val="-1284565066"/>
+        <w:id w:val="-682739649"/>
       </w:sdtPr>
       <w:sdtEndPr/>
       <w:sdtContent>
@@ -550,7 +550,7 @@
           <w:r>
             <w:fldChar w:fldCharType="separate"/>
           </w:r>
-          <w:hyperlink w:anchor="_Toc242893051" w:history="1">
+          <w:hyperlink w:anchor="_Toc242895047" w:history="1">
             <w:r>
               <w:rPr>
                 <w:rStyle w:val="Hipervnculo"/>
@@ -574,7 +574,7 @@
               <w:rPr>
                 <w:noProof/>
               </w:rPr>
-              <w:instrText xml:space="preserve"> PAGEREF _Toc242893051 \h </w:instrText>
+              <w:instrText xml:space="preserve"> PAGEREF _Toc242895047 \h </w:instrText>
             </w:r>
             <w:r>
               <w:rPr>
@@ -611,7 +611,7 @@
               <w:noProof/>
             </w:rPr>
           </w:pPr>
-          <w:hyperlink w:anchor="_Toc242893052" w:history="1">
+          <w:hyperlink w:anchor="_Toc242895048" w:history="1">
             <w:r>
               <w:rPr>
                 <w:rStyle w:val="Hipervnculo"/>
@@ -635,7 +635,7 @@
               <w:rPr>
                 <w:noProof/>
               </w:rPr>
-              <w:instrText xml:space="preserve"> PAGEREF _Toc242893052 \h </w:instrText>
+              <w:instrText xml:space="preserve"> PAGEREF _Toc242895048 \h </w:instrText>
             </w:r>
             <w:r>
               <w:rPr>
@@ -672,7 +672,7 @@
               <w:noProof/>
             </w:rPr>
           </w:pPr>
-          <w:hyperlink w:anchor="_Toc242893053" w:history="1">
+          <w:hyperlink w:anchor="_Toc242895049" w:history="1">
             <w:r>
               <w:rPr>
                 <w:rStyle w:val="Hipervnculo"/>
@@ -696,7 +696,7 @@
               <w:rPr>
                 <w:noProof/>
               </w:rPr>
-              <w:instrText xml:space="preserve"> PAGEREF _Toc242893053 \h </w:instrText>
+              <w:instrText xml:space="preserve"> PAGEREF _Toc242895049 \h </w:instrText>
             </w:r>
             <w:r>
               <w:rPr>
@@ -733,7 +733,7 @@
               <w:noProof/>
             </w:rPr>
           </w:pPr>
-          <w:hyperlink w:anchor="_Toc242893054" w:history="1">
+          <w:hyperlink w:anchor="_Toc242895050" w:history="1">
             <w:r>
               <w:rPr>
                 <w:rStyle w:val="Hipervnculo"/>
@@ -757,7 +757,7 @@
               <w:rPr>
                 <w:noProof/>
               </w:rPr>
-              <w:instrText xml:space="preserve"> PAGEREF _Toc242893054 \h </w:instrText>
+              <w:instrText xml:space="preserve"> PAGEREF _Toc242895050 \h </w:instrText>
             </w:r>
             <w:r>
               <w:rPr>
@@ -794,7 +794,7 @@
               <w:noProof/>
             </w:rPr>
           </w:pPr>
-          <w:hyperlink w:anchor="_Toc242893055" w:history="1">
+          <w:hyperlink w:anchor="_Toc242895051" w:history="1">
             <w:r>
               <w:rPr>
                 <w:rStyle w:val="Hipervnculo"/>
@@ -818,7 +818,7 @@
               <w:rPr>
                 <w:noProof/>
               </w:rPr>
-              <w:instrText xml:space="preserve"> PAGEREF _Toc242893055 \h </w:instrText>
+              <w:instrText xml:space="preserve"> PAGEREF _Toc242895051 \h </w:instrText>
             </w:r>
             <w:r>
               <w:rPr>
@@ -855,7 +855,7 @@
               <w:noProof/>
             </w:rPr>
           </w:pPr>
-          <w:hyperlink w:anchor="_Toc242893056" w:history="1">
+          <w:hyperlink w:anchor="_Toc242895052" w:history="1">
             <w:r>
               <w:rPr>
                 <w:rStyle w:val="Hipervnculo"/>
@@ -879,7 +879,7 @@
               <w:rPr>
                 <w:noProof/>
               </w:rPr>
-              <w:instrText xml:space="preserve"> PAGEREF _Toc242893056 \h </w:instrText>
+              <w:instrText xml:space="preserve"> PAGEREF _Toc242895052 \h </w:instrText>
             </w:r>
             <w:r>
               <w:rPr>
@@ -896,7 +896,7 @@
               <w:rPr>
                 <w:noProof/>
               </w:rPr>
-              <w:t>7</w:t>
+              <w:t>8</w:t>
             </w:r>
             <w:r>
               <w:rPr>
@@ -916,7 +916,7 @@
               <w:noProof/>
             </w:rPr>
           </w:pPr>
-          <w:hyperlink w:anchor="_Toc242893057" w:history="1">
+          <w:hyperlink w:anchor="_Toc242895053" w:history="1">
             <w:r>
               <w:rPr>
                 <w:rStyle w:val="Hipervnculo"/>
@@ -940,7 +940,7 @@
               <w:rPr>
                 <w:noProof/>
               </w:rPr>
-              <w:instrText xml:space="preserve"> PAGEREF _Toc242893057 \h </w:instrText>
+              <w:instrText xml:space="preserve"> PAGEREF _Toc242895053 \h </w:instrText>
             </w:r>
             <w:r>
               <w:rPr>
@@ -957,7 +957,7 @@
               <w:rPr>
                 <w:noProof/>
               </w:rPr>
-              <w:t>8</w:t>
+              <w:t>11</w:t>
             </w:r>
             <w:r>
               <w:rPr>
@@ -977,7 +977,7 @@
               <w:noProof/>
             </w:rPr>
           </w:pPr>
-          <w:hyperlink w:anchor="_Toc242893058" w:history="1">
+          <w:hyperlink w:anchor="_Toc242895054" w:history="1">
             <w:r>
               <w:rPr>
                 <w:rStyle w:val="Hipervnculo"/>
@@ -1001,7 +1001,7 @@
               <w:rPr>
                 <w:noProof/>
               </w:rPr>
-              <w:instrText xml:space="preserve"> PAGEREF _Toc242893058 \h </w:instrText>
+              <w:instrText xml:space="preserve"> PAGEREF _Toc242895054 \h </w:instrText>
             </w:r>
             <w:r>
               <w:rPr>
@@ -1018,7 +1018,7 @@
               <w:rPr>
                 <w:noProof/>
               </w:rPr>
-              <w:t>9</w:t>
+              <w:t>12</w:t>
             </w:r>
             <w:r>
               <w:rPr>
@@ -1038,7 +1038,7 @@
               <w:noProof/>
             </w:rPr>
           </w:pPr>
-          <w:hyperlink w:anchor="_Toc242893059" w:history="1">
+          <w:hyperlink w:anchor="_Toc242895055" w:history="1">
             <w:r>
               <w:rPr>
                 <w:rStyle w:val="Hipervnculo"/>
@@ -1062,7 +1062,7 @@
               <w:rPr>
                 <w:noProof/>
               </w:rPr>
-              <w:instrText xml:space="preserve"> PAGEREF _Toc242893059 \h </w:instrText>
+              <w:instrText xml:space="preserve"> PAGEREF _Toc242895055 \h </w:instrText>
             </w:r>
             <w:r>
               <w:rPr>
@@ -1079,7 +1079,7 @@
               <w:rPr>
                 <w:noProof/>
               </w:rPr>
-              <w:t>10</w:t>
+              <w:t>13</w:t>
             </w:r>
             <w:r>
               <w:rPr>
@@ -1099,7 +1099,7 @@
               <w:noProof/>
             </w:rPr>
           </w:pPr>
-          <w:hyperlink w:anchor="_Toc242893060" w:history="1">
+          <w:hyperlink w:anchor="_Toc242895056" w:history="1">
             <w:r>
               <w:rPr>
                 <w:rStyle w:val="Hipervnculo"/>
@@ -1123,7 +1123,7 @@
               <w:rPr>
                 <w:noProof/>
               </w:rPr>
-              <w:instrText xml:space="preserve"> PAGEREF _Toc242893060 \h </w:instrText>
+              <w:instrText xml:space="preserve"> PAGEREF _Toc242895056 \h </w:instrText>
             </w:r>
             <w:r>
               <w:rPr>
@@ -1140,7 +1140,7 @@
               <w:rPr>
                 <w:noProof/>
               </w:rPr>
-              <w:t>10</w:t>
+              <w:t>13</w:t>
             </w:r>
             <w:r>
               <w:rPr>
@@ -1160,7 +1160,7 @@
               <w:noProof/>
             </w:rPr>
           </w:pPr>
-          <w:hyperlink w:anchor="_Toc242893061" w:history="1">
+          <w:hyperlink w:anchor="_Toc242895057" w:history="1">
             <w:r>
               <w:rPr>
                 <w:rStyle w:val="Hipervnculo"/>
@@ -1184,7 +1184,7 @@
               <w:rPr>
                 <w:noProof/>
               </w:rPr>
-              <w:instrText xml:space="preserve"> PAGEREF _Toc242893061 \h </w:instrText>
+              <w:instrText xml:space="preserve"> PAGEREF _Toc242895057 \h </w:instrText>
             </w:r>
             <w:r>
               <w:rPr>
@@ -1201,7 +1201,7 @@
               <w:rPr>
                 <w:noProof/>
               </w:rPr>
-              <w:t>11</w:t>
+              <w:t>14</w:t>
             </w:r>
             <w:r>
               <w:rPr>
@@ -1221,7 +1221,7 @@
               <w:noProof/>
             </w:rPr>
           </w:pPr>
-          <w:hyperlink w:anchor="_Toc242893062" w:history="1">
+          <w:hyperlink w:anchor="_Toc242895058" w:history="1">
             <w:r>
               <w:rPr>
                 <w:rStyle w:val="Hipervnculo"/>
@@ -1245,7 +1245,7 @@
               <w:rPr>
                 <w:noProof/>
               </w:rPr>
-              <w:instrText xml:space="preserve"> PAGEREF _Toc242893062 \h </w:instrText>
+              <w:instrText xml:space="preserve"> PAGEREF _Toc242895058 \h </w:instrText>
             </w:r>
             <w:r>
               <w:rPr>
@@ -1262,7 +1262,7 @@
               <w:rPr>
                 <w:noProof/>
               </w:rPr>
-              <w:t>11</w:t>
+              <w:t>14</w:t>
             </w:r>
             <w:r>
               <w:rPr>
@@ -1282,7 +1282,7 @@
               <w:noProof/>
             </w:rPr>
           </w:pPr>
-          <w:hyperlink w:anchor="_Toc242893063" w:history="1">
+          <w:hyperlink w:anchor="_Toc242895059" w:history="1">
             <w:r>
               <w:rPr>
                 <w:rStyle w:val="Hipervnculo"/>
@@ -1306,7 +1306,7 @@
               <w:rPr>
                 <w:noProof/>
               </w:rPr>
-              <w:instrText xml:space="preserve"> PAGEREF _Toc242893063 \h </w:instrText>
+              <w:instrText xml:space="preserve"> PAGEREF _Toc242895059 \h </w:instrText>
             </w:r>
             <w:r>
               <w:rPr>
@@ -1323,7 +1323,7 @@
               <w:rPr>
                 <w:noProof/>
               </w:rPr>
-              <w:t>12</w:t>
+              <w:t>15</w:t>
             </w:r>
             <w:r>
               <w:rPr>
@@ -1349,7 +1349,7 @@
       <w:pPr>
         <w:pStyle w:val="Ttulo1"/>
       </w:pPr>
-      <w:bookmarkStart w:id="1" w:name="_Toc242893052"/>
+      <w:bookmarkStart w:id="1" w:name="_Toc242895048"/>
       <w:r>
         <w:t>1. Contexto y arquitectura</w:t>
       </w:r>
@@ -1844,7 +1844,7 @@
       <w:pPr>
         <w:pStyle w:val="Ttulo1"/>
       </w:pPr>
-      <w:bookmarkStart w:id="2" w:name="_Toc242893053"/>
+      <w:bookmarkStart w:id="2" w:name="_Toc242895049"/>
       <w:r>
         <w:t>2. Evidencia técnica</w:t>
       </w:r>
@@ -1854,7 +1854,7 @@
       <w:pPr>
         <w:pStyle w:val="Ttulo2"/>
       </w:pPr>
-      <w:bookmarkStart w:id="3" w:name="_Toc242893054"/>
+      <w:bookmarkStart w:id="3" w:name="_Toc242895050"/>
       <w:r>
         <w:t>2.1 Bloque 1 — Lectura streaming y agregación por ventana</w:t>
       </w:r>
@@ -2239,90 +2239,70 @@
         <w:t>Extracto 2. Esquema parseado del evento red.lectura</w:t>
       </w:r>
     </w:p>
-    <w:tbl>
-      <w:tblPr>
-        <w:tblW w:w="9026" w:type="dxa"/>
-        <w:tblBorders>
-          <w:top w:val="single" w:sz="4" w:space="0" w:color="auto"/>
-          <w:left w:val="single" w:sz="4" w:space="0" w:color="auto"/>
-          <w:bottom w:val="single" w:sz="4" w:space="0" w:color="auto"/>
-          <w:right w:val="single" w:sz="4" w:space="0" w:color="auto"/>
-          <w:insideH w:val="single" w:sz="4" w:space="0" w:color="auto"/>
-          <w:insideV w:val="single" w:sz="4" w:space="0" w:color="auto"/>
-        </w:tblBorders>
-        <w:tblLook w:val="04A0" w:firstRow="1" w:lastRow="0" w:firstColumn="1" w:lastColumn="0" w:noHBand="0" w:noVBand="1"/>
-      </w:tblPr>
-      <w:tblGrid>
-        <w:gridCol w:w="9026"/>
-      </w:tblGrid>
-      <w:tr>
-        <w:tc>
-          <w:tcPr>
-            <w:tcW w:w="9026" w:type="dxa"/>
-            <w:tcBorders>
-              <w:top w:val="dashed" w:sz="8" w:space="0" w:color="C00000"/>
-              <w:left w:val="dashed" w:sz="8" w:space="0" w:color="C00000"/>
-              <w:bottom w:val="dashed" w:sz="8" w:space="0" w:color="C00000"/>
-              <w:right w:val="dashed" w:sz="8" w:space="0" w:color="C00000"/>
-            </w:tcBorders>
-            <w:shd w:val="clear" w:color="auto" w:fill="FFF5F5"/>
-            <w:tcMar>
-              <w:top w:w="200" w:type="dxa"/>
-              <w:left w:w="200" w:type="dxa"/>
-              <w:bottom w:w="200" w:type="dxa"/>
-              <w:right w:w="200" w:type="dxa"/>
-            </w:tcMar>
-          </w:tcPr>
-          <w:p>
-            <w:pPr>
-              <w:jc w:val="center"/>
-            </w:pPr>
-            <w:r>
-              <w:rPr>
-                <w:b/>
-                <w:bCs/>
-                <w:color w:val="C00000"/>
-                <w:sz w:val="20"/>
-                <w:szCs w:val="20"/>
-              </w:rPr>
-              <w:t>[ INSERTAR CAPTURA DE PANTALLA ]</w:t>
-            </w:r>
-          </w:p>
-          <w:p>
-            <w:pPr>
-              <w:jc w:val="center"/>
-            </w:pPr>
-            <w:r>
-              <w:rPr>
-                <w:color w:val="7F7F7F"/>
-                <w:sz w:val="18"/>
-                <w:szCs w:val="18"/>
-              </w:rPr>
-              <w:t>Notebook en Jupyter (localhost:4488) mostrando la celda 3.4 con eventos.printSchema().</w:t>
-            </w:r>
-          </w:p>
-          <w:p>
-            <w:pPr>
-              <w:jc w:val="center"/>
-            </w:pPr>
-            <w:r>
-              <w:rPr>
-                <w:i/>
-                <w:iCs/>
-                <w:color w:val="7F7F7F"/>
-                <w:sz w:val="16"/>
-                <w:szCs w:val="16"/>
-              </w:rPr>
-              <w:t>Pantalla completa, sin recortar: reloj de Windows (fecha y hora) y usuario/perfil visibles.</w:t>
-            </w:r>
-          </w:p>
-        </w:tc>
-      </w:tr>
-    </w:tbl>
     <w:p>
       <w:pPr>
-        <w:spacing w:after="160"/>
-      </w:pPr>
+        <w:spacing w:before="120" w:after="40"/>
+        <w:jc w:val="center"/>
+      </w:pPr>
+      <w:r>
+        <w:rPr>
+          <w:noProof/>
+        </w:rPr>
+        <w:drawing>
+          <wp:inline distT="0" distB="0" distL="0" distR="0">
+            <wp:extent cx="5715000" cy="3219450"/>
+            <wp:effectExtent l="0" t="0" r="0" b="0"/>
+            <wp:docPr id="1" name="s08_cap1.png" descr="Notebook en Jupyter (localhost:4488) mostrando la celda 3.4 con eventos.printSchema()." title="Captura 1"/>
+            <wp:cNvGraphicFramePr>
+              <a:graphicFrameLocks xmlns:a="http://schemas.openxmlformats.org/drawingml/2006/main" noChangeAspect="1"/>
+            </wp:cNvGraphicFramePr>
+            <a:graphic xmlns:a="http://schemas.openxmlformats.org/drawingml/2006/main">
+              <a:graphicData uri="http://schemas.openxmlformats.org/drawingml/2006/picture">
+                <pic:pic xmlns:pic="http://schemas.openxmlformats.org/drawingml/2006/picture">
+                  <pic:nvPicPr>
+                    <pic:cNvPr id="0" name=""/>
+                    <pic:cNvPicPr>
+                      <a:picLocks noChangeAspect="1" noChangeArrowheads="1"/>
+                    </pic:cNvPicPr>
+                  </pic:nvPicPr>
+                  <pic:blipFill>
+                    <a:blip r:embed="rId7"/>
+                    <a:srcRect/>
+                    <a:stretch>
+                      <a:fillRect/>
+                    </a:stretch>
+                  </pic:blipFill>
+                  <pic:spPr bwMode="auto">
+                    <a:xfrm>
+                      <a:off x="0" y="0"/>
+                      <a:ext cx="5715000" cy="3219450"/>
+                    </a:xfrm>
+                    <a:prstGeom prst="rect">
+                      <a:avLst/>
+                    </a:prstGeom>
+                  </pic:spPr>
+                </pic:pic>
+              </a:graphicData>
+            </a:graphic>
+          </wp:inline>
+        </w:drawing>
+      </w:r>
+    </w:p>
+    <w:p>
+      <w:pPr>
+        <w:spacing w:after="200"/>
+        <w:jc w:val="center"/>
+      </w:pPr>
+      <w:r>
+        <w:rPr>
+          <w:i/>
+          <w:iCs/>
+          <w:color w:val="595959"/>
+          <w:sz w:val="18"/>
+          <w:szCs w:val="18"/>
+        </w:rPr>
+        <w:t>Captura 1. Notebook en Jupyter (localhost:4488) mostrando la celda 3.4 con eventos.printSchema(). (pantalla completa: reloj de Windows y perfil de Chrome visibles).</w:t>
+      </w:r>
     </w:p>
     <w:p>
       <w:pPr>
@@ -2917,90 +2897,70 @@
         <w:t>Extracto 5. Lotes 2 y 3 en modo update: solo se reimprime la ventana que cambió (n pasa de 5 a 10); las ventanas ya cerradas no vuelven a aparecer</w:t>
       </w:r>
     </w:p>
-    <w:tbl>
-      <w:tblPr>
-        <w:tblW w:w="9026" w:type="dxa"/>
-        <w:tblBorders>
-          <w:top w:val="single" w:sz="4" w:space="0" w:color="auto"/>
-          <w:left w:val="single" w:sz="4" w:space="0" w:color="auto"/>
-          <w:bottom w:val="single" w:sz="4" w:space="0" w:color="auto"/>
-          <w:right w:val="single" w:sz="4" w:space="0" w:color="auto"/>
-          <w:insideH w:val="single" w:sz="4" w:space="0" w:color="auto"/>
-          <w:insideV w:val="single" w:sz="4" w:space="0" w:color="auto"/>
-        </w:tblBorders>
-        <w:tblLook w:val="04A0" w:firstRow="1" w:lastRow="0" w:firstColumn="1" w:lastColumn="0" w:noHBand="0" w:noVBand="1"/>
-      </w:tblPr>
-      <w:tblGrid>
-        <w:gridCol w:w="9026"/>
-      </w:tblGrid>
-      <w:tr>
-        <w:tc>
-          <w:tcPr>
-            <w:tcW w:w="9026" w:type="dxa"/>
-            <w:tcBorders>
-              <w:top w:val="dashed" w:sz="8" w:space="0" w:color="C00000"/>
-              <w:left w:val="dashed" w:sz="8" w:space="0" w:color="C00000"/>
-              <w:bottom w:val="dashed" w:sz="8" w:space="0" w:color="C00000"/>
-              <w:right w:val="dashed" w:sz="8" w:space="0" w:color="C00000"/>
-            </w:tcBorders>
-            <w:shd w:val="clear" w:color="auto" w:fill="FFF5F5"/>
-            <w:tcMar>
-              <w:top w:w="200" w:type="dxa"/>
-              <w:left w:w="200" w:type="dxa"/>
-              <w:bottom w:w="200" w:type="dxa"/>
-              <w:right w:w="200" w:type="dxa"/>
-            </w:tcMar>
-          </w:tcPr>
-          <w:p>
-            <w:pPr>
-              <w:jc w:val="center"/>
-            </w:pPr>
-            <w:r>
-              <w:rPr>
-                <w:b/>
-                <w:bCs/>
-                <w:color w:val="C00000"/>
-                <w:sz w:val="20"/>
-                <w:szCs w:val="20"/>
-              </w:rPr>
-              <w:t>[ INSERTAR CAPTURA DE PANTALLA ]</w:t>
-            </w:r>
-          </w:p>
-          <w:p>
-            <w:pPr>
-              <w:jc w:val="center"/>
-            </w:pPr>
-            <w:r>
-              <w:rPr>
-                <w:color w:val="7F7F7F"/>
-                <w:sz w:val="18"/>
-                <w:szCs w:val="18"/>
-              </w:rPr>
-              <w:t>Salida de la celda 3.8 (agregación con watermark actualizándose) y tabla de estado por micro-lote.</w:t>
-            </w:r>
-          </w:p>
-          <w:p>
-            <w:pPr>
-              <w:jc w:val="center"/>
-            </w:pPr>
-            <w:r>
-              <w:rPr>
-                <w:i/>
-                <w:iCs/>
-                <w:color w:val="7F7F7F"/>
-                <w:sz w:val="16"/>
-                <w:szCs w:val="16"/>
-              </w:rPr>
-              <w:t>Pantalla completa, sin recortar: reloj de Windows (fecha y hora) y usuario/perfil visibles.</w:t>
-            </w:r>
-          </w:p>
-        </w:tc>
-      </w:tr>
-    </w:tbl>
     <w:p>
       <w:pPr>
-        <w:spacing w:after="160"/>
-      </w:pPr>
+        <w:spacing w:before="120" w:after="40"/>
+        <w:jc w:val="center"/>
+      </w:pPr>
+      <w:r>
+        <w:rPr>
+          <w:noProof/>
+        </w:rPr>
+        <w:drawing>
+          <wp:inline distT="0" distB="0" distL="0" distR="0">
+            <wp:extent cx="5715000" cy="3219450"/>
+            <wp:effectExtent l="0" t="0" r="0" b="0"/>
+            <wp:docPr id="2" name="s08_cap2.png" descr="Salida de la celda 3.8 (agregación con watermark actualizándose) y tabla de estado por micro-lote." title="Captura 2"/>
+            <wp:cNvGraphicFramePr>
+              <a:graphicFrameLocks xmlns:a="http://schemas.openxmlformats.org/drawingml/2006/main" noChangeAspect="1"/>
+            </wp:cNvGraphicFramePr>
+            <a:graphic xmlns:a="http://schemas.openxmlformats.org/drawingml/2006/main">
+              <a:graphicData uri="http://schemas.openxmlformats.org/drawingml/2006/picture">
+                <pic:pic xmlns:pic="http://schemas.openxmlformats.org/drawingml/2006/picture">
+                  <pic:nvPicPr>
+                    <pic:cNvPr id="0" name=""/>
+                    <pic:cNvPicPr>
+                      <a:picLocks noChangeAspect="1" noChangeArrowheads="1"/>
+                    </pic:cNvPicPr>
+                  </pic:nvPicPr>
+                  <pic:blipFill>
+                    <a:blip r:embed="rId8"/>
+                    <a:srcRect/>
+                    <a:stretch>
+                      <a:fillRect/>
+                    </a:stretch>
+                  </pic:blipFill>
+                  <pic:spPr bwMode="auto">
+                    <a:xfrm>
+                      <a:off x="0" y="0"/>
+                      <a:ext cx="5715000" cy="3219450"/>
+                    </a:xfrm>
+                    <a:prstGeom prst="rect">
+                      <a:avLst/>
+                    </a:prstGeom>
+                  </pic:spPr>
+                </pic:pic>
+              </a:graphicData>
+            </a:graphic>
+          </wp:inline>
+        </w:drawing>
+      </w:r>
+    </w:p>
+    <w:p>
+      <w:pPr>
+        <w:spacing w:after="200"/>
+        <w:jc w:val="center"/>
+      </w:pPr>
+      <w:r>
+        <w:rPr>
+          <w:i/>
+          <w:iCs/>
+          <w:color w:val="595959"/>
+          <w:sz w:val="18"/>
+          <w:szCs w:val="18"/>
+        </w:rPr>
+        <w:t>Captura 2. Salida de la celda 3.8 (agregación con watermark actualizándose) y tabla de estado por micro-lote. (pantalla completa: reloj de Windows y perfil de Chrome visibles).</w:t>
+      </w:r>
     </w:p>
     <w:p>
       <w:pPr>
@@ -3819,7 +3779,7 @@
       <w:pPr>
         <w:pStyle w:val="Ttulo2"/>
       </w:pPr>
-      <w:bookmarkStart w:id="4" w:name="_Toc242893055"/>
+      <w:bookmarkStart w:id="4" w:name="_Toc242895051"/>
       <w:r>
         <w:t>2.2 Bloque 2 — Dato tardío y deduplicación</w:t>
       </w:r>
@@ -4137,90 +4097,70 @@
         <w:t>Extracto 7. Evento tardío: presente en Kafka, ausente en la salida agregada</w:t>
       </w:r>
     </w:p>
-    <w:tbl>
-      <w:tblPr>
-        <w:tblW w:w="9026" w:type="dxa"/>
-        <w:tblBorders>
-          <w:top w:val="single" w:sz="4" w:space="0" w:color="auto"/>
-          <w:left w:val="single" w:sz="4" w:space="0" w:color="auto"/>
-          <w:bottom w:val="single" w:sz="4" w:space="0" w:color="auto"/>
-          <w:right w:val="single" w:sz="4" w:space="0" w:color="auto"/>
-          <w:insideH w:val="single" w:sz="4" w:space="0" w:color="auto"/>
-          <w:insideV w:val="single" w:sz="4" w:space="0" w:color="auto"/>
-        </w:tblBorders>
-        <w:tblLook w:val="04A0" w:firstRow="1" w:lastRow="0" w:firstColumn="1" w:lastColumn="0" w:noHBand="0" w:noVBand="1"/>
-      </w:tblPr>
-      <w:tblGrid>
-        <w:gridCol w:w="9026"/>
-      </w:tblGrid>
-      <w:tr>
-        <w:tc>
-          <w:tcPr>
-            <w:tcW w:w="9026" w:type="dxa"/>
-            <w:tcBorders>
-              <w:top w:val="dashed" w:sz="8" w:space="0" w:color="C00000"/>
-              <w:left w:val="dashed" w:sz="8" w:space="0" w:color="C00000"/>
-              <w:bottom w:val="dashed" w:sz="8" w:space="0" w:color="C00000"/>
-              <w:right w:val="dashed" w:sz="8" w:space="0" w:color="C00000"/>
-            </w:tcBorders>
-            <w:shd w:val="clear" w:color="auto" w:fill="FFF5F5"/>
-            <w:tcMar>
-              <w:top w:w="200" w:type="dxa"/>
-              <w:left w:w="200" w:type="dxa"/>
-              <w:bottom w:w="200" w:type="dxa"/>
-              <w:right w:w="200" w:type="dxa"/>
-            </w:tcMar>
-          </w:tcPr>
-          <w:p>
-            <w:pPr>
-              <w:jc w:val="center"/>
-            </w:pPr>
-            <w:r>
-              <w:rPr>
-                <w:b/>
-                <w:bCs/>
-                <w:color w:val="C00000"/>
-                <w:sz w:val="20"/>
-                <w:szCs w:val="20"/>
-              </w:rPr>
-              <w:t>[ INSERTAR CAPTURA DE PANTALLA ]</w:t>
-            </w:r>
-          </w:p>
-          <w:p>
-            <w:pPr>
-              <w:jc w:val="center"/>
-            </w:pPr>
-            <w:r>
-              <w:rPr>
-                <w:color w:val="7F7F7F"/>
-                <w:sz w:val="18"/>
-                <w:szCs w:val="18"/>
-              </w:rPr>
-              <w:t>Celda 3.11: mensaje '&gt;&gt;&gt; publicado nic-tardio…', lotes posteriores sin nic-tardio y verificación final (0 apariciones).</w:t>
-            </w:r>
-          </w:p>
-          <w:p>
-            <w:pPr>
-              <w:jc w:val="center"/>
-            </w:pPr>
-            <w:r>
-              <w:rPr>
-                <w:i/>
-                <w:iCs/>
-                <w:color w:val="7F7F7F"/>
-                <w:sz w:val="16"/>
-                <w:szCs w:val="16"/>
-              </w:rPr>
-              <w:t>Pantalla completa, sin recortar: reloj de Windows (fecha y hora) y usuario/perfil visibles.</w:t>
-            </w:r>
-          </w:p>
-        </w:tc>
-      </w:tr>
-    </w:tbl>
     <w:p>
       <w:pPr>
-        <w:spacing w:after="160"/>
-      </w:pPr>
+        <w:spacing w:before="120" w:after="40"/>
+        <w:jc w:val="center"/>
+      </w:pPr>
+      <w:r>
+        <w:rPr>
+          <w:noProof/>
+        </w:rPr>
+        <w:drawing>
+          <wp:inline distT="0" distB="0" distL="0" distR="0">
+            <wp:extent cx="5715000" cy="3219450"/>
+            <wp:effectExtent l="0" t="0" r="0" b="0"/>
+            <wp:docPr id="3" name="s08_cap3.png" descr="Celda 3.11: mensaje '&gt;&gt;&gt; publicado nic-tardio…', lotes posteriores sin nic-tardio y verificación final (0 apariciones)." title="Captura 3"/>
+            <wp:cNvGraphicFramePr>
+              <a:graphicFrameLocks xmlns:a="http://schemas.openxmlformats.org/drawingml/2006/main" noChangeAspect="1"/>
+            </wp:cNvGraphicFramePr>
+            <a:graphic xmlns:a="http://schemas.openxmlformats.org/drawingml/2006/main">
+              <a:graphicData uri="http://schemas.openxmlformats.org/drawingml/2006/picture">
+                <pic:pic xmlns:pic="http://schemas.openxmlformats.org/drawingml/2006/picture">
+                  <pic:nvPicPr>
+                    <pic:cNvPr id="0" name=""/>
+                    <pic:cNvPicPr>
+                      <a:picLocks noChangeAspect="1" noChangeArrowheads="1"/>
+                    </pic:cNvPicPr>
+                  </pic:nvPicPr>
+                  <pic:blipFill>
+                    <a:blip r:embed="rId9"/>
+                    <a:srcRect/>
+                    <a:stretch>
+                      <a:fillRect/>
+                    </a:stretch>
+                  </pic:blipFill>
+                  <pic:spPr bwMode="auto">
+                    <a:xfrm>
+                      <a:off x="0" y="0"/>
+                      <a:ext cx="5715000" cy="3219450"/>
+                    </a:xfrm>
+                    <a:prstGeom prst="rect">
+                      <a:avLst/>
+                    </a:prstGeom>
+                  </pic:spPr>
+                </pic:pic>
+              </a:graphicData>
+            </a:graphic>
+          </wp:inline>
+        </w:drawing>
+      </w:r>
+    </w:p>
+    <w:p>
+      <w:pPr>
+        <w:spacing w:after="200"/>
+        <w:jc w:val="center"/>
+      </w:pPr>
+      <w:r>
+        <w:rPr>
+          <w:i/>
+          <w:iCs/>
+          <w:color w:val="595959"/>
+          <w:sz w:val="18"/>
+          <w:szCs w:val="18"/>
+        </w:rPr>
+        <w:t>Captura 3. Celda 3.11: mensaje '&gt;&gt;&gt; publicado nic-tardio…', lotes posteriores sin nic-tardio y verificación final (0 apariciones). (pantalla completa: reloj de Windows y perfil de Chrome visibles).</w:t>
+      </w:r>
     </w:p>
     <w:p>
       <w:pPr>
@@ -4475,96 +4415,76 @@
         <w:t xml:space="preserve"> crudo, sin watermark), Spark no podría saber cuándo olvidar una clave y el estado de deduplicación crecería sin límite.</w:t>
       </w:r>
     </w:p>
-    <w:tbl>
-      <w:tblPr>
-        <w:tblW w:w="9026" w:type="dxa"/>
-        <w:tblBorders>
-          <w:top w:val="single" w:sz="4" w:space="0" w:color="auto"/>
-          <w:left w:val="single" w:sz="4" w:space="0" w:color="auto"/>
-          <w:bottom w:val="single" w:sz="4" w:space="0" w:color="auto"/>
-          <w:right w:val="single" w:sz="4" w:space="0" w:color="auto"/>
-          <w:insideH w:val="single" w:sz="4" w:space="0" w:color="auto"/>
-          <w:insideV w:val="single" w:sz="4" w:space="0" w:color="auto"/>
-        </w:tblBorders>
-        <w:tblLook w:val="04A0" w:firstRow="1" w:lastRow="0" w:firstColumn="1" w:lastColumn="0" w:noHBand="0" w:noVBand="1"/>
-      </w:tblPr>
-      <w:tblGrid>
-        <w:gridCol w:w="9026"/>
-      </w:tblGrid>
-      <w:tr>
-        <w:tc>
-          <w:tcPr>
-            <w:tcW w:w="9026" w:type="dxa"/>
-            <w:tcBorders>
-              <w:top w:val="dashed" w:sz="8" w:space="0" w:color="C00000"/>
-              <w:left w:val="dashed" w:sz="8" w:space="0" w:color="C00000"/>
-              <w:bottom w:val="dashed" w:sz="8" w:space="0" w:color="C00000"/>
-              <w:right w:val="dashed" w:sz="8" w:space="0" w:color="C00000"/>
-            </w:tcBorders>
-            <w:shd w:val="clear" w:color="auto" w:fill="FFF5F5"/>
-            <w:tcMar>
-              <w:top w:w="200" w:type="dxa"/>
-              <w:left w:w="200" w:type="dxa"/>
-              <w:bottom w:w="200" w:type="dxa"/>
-              <w:right w:w="200" w:type="dxa"/>
-            </w:tcMar>
-          </w:tcPr>
-          <w:p>
-            <w:pPr>
-              <w:jc w:val="center"/>
-            </w:pPr>
-            <w:r>
-              <w:rPr>
-                <w:b/>
-                <w:bCs/>
-                <w:color w:val="C00000"/>
-                <w:sz w:val="20"/>
-                <w:szCs w:val="20"/>
-              </w:rPr>
-              <w:t>[ INSERTAR CAPTURA DE PANTALLA ]</w:t>
-            </w:r>
-          </w:p>
-          <w:p>
-            <w:pPr>
-              <w:jc w:val="center"/>
-            </w:pPr>
-            <w:r>
-              <w:rPr>
-                <w:color w:val="7F7F7F"/>
-                <w:sz w:val="18"/>
-                <w:szCs w:val="18"/>
-              </w:rPr>
-              <w:t>Celda 3.12: '&gt;&gt;&gt; nic-duplicado publicado DOS veces', lote con una sola fila de nic-duplicado y conteo Kafka vs salida.</w:t>
-            </w:r>
-          </w:p>
-          <w:p>
-            <w:pPr>
-              <w:jc w:val="center"/>
-            </w:pPr>
-            <w:r>
-              <w:rPr>
-                <w:i/>
-                <w:iCs/>
-                <w:color w:val="7F7F7F"/>
-                <w:sz w:val="16"/>
-                <w:szCs w:val="16"/>
-              </w:rPr>
-              <w:t>Pantalla completa, sin recortar: reloj de Windows (fecha y hora) y usuario/perfil visibles.</w:t>
-            </w:r>
-          </w:p>
-        </w:tc>
-      </w:tr>
-    </w:tbl>
     <w:p>
       <w:pPr>
-        <w:spacing w:after="160"/>
-      </w:pPr>
+        <w:spacing w:before="120" w:after="40"/>
+        <w:jc w:val="center"/>
+      </w:pPr>
+      <w:r>
+        <w:rPr>
+          <w:noProof/>
+        </w:rPr>
+        <w:drawing>
+          <wp:inline distT="0" distB="0" distL="0" distR="0">
+            <wp:extent cx="5715000" cy="3219450"/>
+            <wp:effectExtent l="0" t="0" r="0" b="0"/>
+            <wp:docPr id="4" name="s08_cap4.png" descr="Celda 3.12: '&gt;&gt;&gt; nic-duplicado publicado DOS veces', lote con una sola fila de nic-duplicado y conteo Kafka vs salida." title="Captura 4"/>
+            <wp:cNvGraphicFramePr>
+              <a:graphicFrameLocks xmlns:a="http://schemas.openxmlformats.org/drawingml/2006/main" noChangeAspect="1"/>
+            </wp:cNvGraphicFramePr>
+            <a:graphic xmlns:a="http://schemas.openxmlformats.org/drawingml/2006/main">
+              <a:graphicData uri="http://schemas.openxmlformats.org/drawingml/2006/picture">
+                <pic:pic xmlns:pic="http://schemas.openxmlformats.org/drawingml/2006/picture">
+                  <pic:nvPicPr>
+                    <pic:cNvPr id="0" name=""/>
+                    <pic:cNvPicPr>
+                      <a:picLocks noChangeAspect="1" noChangeArrowheads="1"/>
+                    </pic:cNvPicPr>
+                  </pic:nvPicPr>
+                  <pic:blipFill>
+                    <a:blip r:embed="rId10"/>
+                    <a:srcRect/>
+                    <a:stretch>
+                      <a:fillRect/>
+                    </a:stretch>
+                  </pic:blipFill>
+                  <pic:spPr bwMode="auto">
+                    <a:xfrm>
+                      <a:off x="0" y="0"/>
+                      <a:ext cx="5715000" cy="3219450"/>
+                    </a:xfrm>
+                    <a:prstGeom prst="rect">
+                      <a:avLst/>
+                    </a:prstGeom>
+                  </pic:spPr>
+                </pic:pic>
+              </a:graphicData>
+            </a:graphic>
+          </wp:inline>
+        </w:drawing>
+      </w:r>
     </w:p>
     <w:p>
       <w:pPr>
+        <w:spacing w:after="200"/>
+        <w:jc w:val="center"/>
+      </w:pPr>
+      <w:r>
+        <w:rPr>
+          <w:i/>
+          <w:iCs/>
+          <w:color w:val="595959"/>
+          <w:sz w:val="18"/>
+          <w:szCs w:val="18"/>
+        </w:rPr>
+        <w:t>Captura 4. Celda 3.12: '&gt;&gt;&gt; nic-duplicado publicado DOS veces', lote con una sola fila de nic-duplicado y conteo Kafka vs salida. (pantalla completa: reloj de Windows y perfil de Chrome visibles).</w:t>
+      </w:r>
+    </w:p>
+    <w:p>
+      <w:pPr>
         <w:pStyle w:val="Ttulo2"/>
       </w:pPr>
-      <w:bookmarkStart w:id="5" w:name="_Toc242893056"/>
+      <w:bookmarkStart w:id="5" w:name="_Toc242895052"/>
       <w:r>
         <w:t>2.3 Bloque 3 — Intervalo de disparo y checkpoint</w:t>
       </w:r>
@@ -5320,90 +5240,70 @@
         <w:t>El disparo de 1 s corre muchos más micro-lotes con ~3 filas cada uno y entrega cada lectura en ~0,56 s; el de 6 s junta ~16 filas por lote (más throughput por lote, menos overhead de coordinación) a costa de ~2,7 s de latencia media, casi 5 veces más. La duración de cada lote es similar en ambos casos, lo que muestra que con el disparo rápido se paga casi el mismo costo fijo muchas más veces por minuto.</w:t>
       </w:r>
     </w:p>
-    <w:tbl>
-      <w:tblPr>
-        <w:tblW w:w="9026" w:type="dxa"/>
-        <w:tblBorders>
-          <w:top w:val="single" w:sz="4" w:space="0" w:color="auto"/>
-          <w:left w:val="single" w:sz="4" w:space="0" w:color="auto"/>
-          <w:bottom w:val="single" w:sz="4" w:space="0" w:color="auto"/>
-          <w:right w:val="single" w:sz="4" w:space="0" w:color="auto"/>
-          <w:insideH w:val="single" w:sz="4" w:space="0" w:color="auto"/>
-          <w:insideV w:val="single" w:sz="4" w:space="0" w:color="auto"/>
-        </w:tblBorders>
-        <w:tblLook w:val="04A0" w:firstRow="1" w:lastRow="0" w:firstColumn="1" w:lastColumn="0" w:noHBand="0" w:noVBand="1"/>
-      </w:tblPr>
-      <w:tblGrid>
-        <w:gridCol w:w="9026"/>
-      </w:tblGrid>
-      <w:tr>
-        <w:tc>
-          <w:tcPr>
-            <w:tcW w:w="9026" w:type="dxa"/>
-            <w:tcBorders>
-              <w:top w:val="dashed" w:sz="8" w:space="0" w:color="C00000"/>
-              <w:left w:val="dashed" w:sz="8" w:space="0" w:color="C00000"/>
-              <w:bottom w:val="dashed" w:sz="8" w:space="0" w:color="C00000"/>
-              <w:right w:val="dashed" w:sz="8" w:space="0" w:color="C00000"/>
-            </w:tcBorders>
-            <w:shd w:val="clear" w:color="auto" w:fill="FFF5F5"/>
-            <w:tcMar>
-              <w:top w:w="200" w:type="dxa"/>
-              <w:left w:w="200" w:type="dxa"/>
-              <w:bottom w:w="200" w:type="dxa"/>
-              <w:right w:w="200" w:type="dxa"/>
-            </w:tcMar>
-          </w:tcPr>
-          <w:p>
-            <w:pPr>
-              <w:jc w:val="center"/>
-            </w:pPr>
-            <w:r>
-              <w:rPr>
-                <w:b/>
-                <w:bCs/>
-                <w:color w:val="C00000"/>
-                <w:sz w:val="20"/>
-                <w:szCs w:val="20"/>
-              </w:rPr>
-              <w:t>[ INSERTAR CAPTURA DE PANTALLA ]</w:t>
-            </w:r>
-          </w:p>
-          <w:p>
-            <w:pPr>
-              <w:jc w:val="center"/>
-            </w:pPr>
-            <w:r>
-              <w:rPr>
-                <w:color w:val="7F7F7F"/>
-                <w:sz w:val="18"/>
-                <w:szCs w:val="18"/>
-              </w:rPr>
-              <w:t>Celda 3.13 con los dos batchId y el diccionario de métricas por trigger.</w:t>
-            </w:r>
-          </w:p>
-          <w:p>
-            <w:pPr>
-              <w:jc w:val="center"/>
-            </w:pPr>
-            <w:r>
-              <w:rPr>
-                <w:i/>
-                <w:iCs/>
-                <w:color w:val="7F7F7F"/>
-                <w:sz w:val="16"/>
-                <w:szCs w:val="16"/>
-              </w:rPr>
-              <w:t>Pantalla completa, sin recortar: reloj de Windows (fecha y hora) y usuario/perfil visibles.</w:t>
-            </w:r>
-          </w:p>
-        </w:tc>
-      </w:tr>
-    </w:tbl>
     <w:p>
       <w:pPr>
-        <w:spacing w:after="160"/>
-      </w:pPr>
+        <w:spacing w:before="120" w:after="40"/>
+        <w:jc w:val="center"/>
+      </w:pPr>
+      <w:r>
+        <w:rPr>
+          <w:noProof/>
+        </w:rPr>
+        <w:drawing>
+          <wp:inline distT="0" distB="0" distL="0" distR="0">
+            <wp:extent cx="5715000" cy="3219450"/>
+            <wp:effectExtent l="0" t="0" r="0" b="0"/>
+            <wp:docPr id="5" name="s08_cap5.png" descr="Celda 3.13 con los dos batchId y el diccionario de métricas por trigger." title="Captura 5"/>
+            <wp:cNvGraphicFramePr>
+              <a:graphicFrameLocks xmlns:a="http://schemas.openxmlformats.org/drawingml/2006/main" noChangeAspect="1"/>
+            </wp:cNvGraphicFramePr>
+            <a:graphic xmlns:a="http://schemas.openxmlformats.org/drawingml/2006/main">
+              <a:graphicData uri="http://schemas.openxmlformats.org/drawingml/2006/picture">
+                <pic:pic xmlns:pic="http://schemas.openxmlformats.org/drawingml/2006/picture">
+                  <pic:nvPicPr>
+                    <pic:cNvPr id="0" name=""/>
+                    <pic:cNvPicPr>
+                      <a:picLocks noChangeAspect="1" noChangeArrowheads="1"/>
+                    </pic:cNvPicPr>
+                  </pic:nvPicPr>
+                  <pic:blipFill>
+                    <a:blip r:embed="rId11"/>
+                    <a:srcRect/>
+                    <a:stretch>
+                      <a:fillRect/>
+                    </a:stretch>
+                  </pic:blipFill>
+                  <pic:spPr bwMode="auto">
+                    <a:xfrm>
+                      <a:off x="0" y="0"/>
+                      <a:ext cx="5715000" cy="3219450"/>
+                    </a:xfrm>
+                    <a:prstGeom prst="rect">
+                      <a:avLst/>
+                    </a:prstGeom>
+                  </pic:spPr>
+                </pic:pic>
+              </a:graphicData>
+            </a:graphic>
+          </wp:inline>
+        </w:drawing>
+      </w:r>
+    </w:p>
+    <w:p>
+      <w:pPr>
+        <w:spacing w:after="200"/>
+        <w:jc w:val="center"/>
+      </w:pPr>
+      <w:r>
+        <w:rPr>
+          <w:i/>
+          <w:iCs/>
+          <w:color w:val="595959"/>
+          <w:sz w:val="18"/>
+          <w:szCs w:val="18"/>
+        </w:rPr>
+        <w:t>Captura 5. Celda 3.13 con los dos batchId y el diccionario de métricas por trigger. (pantalla completa: reloj de Windows y perfil de Chrome visibles).</w:t>
+      </w:r>
     </w:p>
     <w:p>
       <w:pPr>
@@ -6331,96 +6231,141 @@
         <w:t>Extracto 11. Reinicio de la consulta desde el checkpoint</w:t>
       </w:r>
     </w:p>
-    <w:tbl>
-      <w:tblPr>
-        <w:tblW w:w="9026" w:type="dxa"/>
-        <w:tblBorders>
-          <w:top w:val="single" w:sz="4" w:space="0" w:color="auto"/>
-          <w:left w:val="single" w:sz="4" w:space="0" w:color="auto"/>
-          <w:bottom w:val="single" w:sz="4" w:space="0" w:color="auto"/>
-          <w:right w:val="single" w:sz="4" w:space="0" w:color="auto"/>
-          <w:insideH w:val="single" w:sz="4" w:space="0" w:color="auto"/>
-          <w:insideV w:val="single" w:sz="4" w:space="0" w:color="auto"/>
-        </w:tblBorders>
-        <w:tblLook w:val="04A0" w:firstRow="1" w:lastRow="0" w:firstColumn="1" w:lastColumn="0" w:noHBand="0" w:noVBand="1"/>
-      </w:tblPr>
-      <w:tblGrid>
-        <w:gridCol w:w="9026"/>
-      </w:tblGrid>
-      <w:tr>
-        <w:tc>
-          <w:tcPr>
-            <w:tcW w:w="9026" w:type="dxa"/>
-            <w:tcBorders>
-              <w:top w:val="dashed" w:sz="8" w:space="0" w:color="C00000"/>
-              <w:left w:val="dashed" w:sz="8" w:space="0" w:color="C00000"/>
-              <w:bottom w:val="dashed" w:sz="8" w:space="0" w:color="C00000"/>
-              <w:right w:val="dashed" w:sz="8" w:space="0" w:color="C00000"/>
-            </w:tcBorders>
-            <w:shd w:val="clear" w:color="auto" w:fill="FFF5F5"/>
-            <w:tcMar>
-              <w:top w:w="200" w:type="dxa"/>
-              <w:left w:w="200" w:type="dxa"/>
-              <w:bottom w:w="200" w:type="dxa"/>
-              <w:right w:w="200" w:type="dxa"/>
-            </w:tcMar>
-          </w:tcPr>
-          <w:p>
-            <w:pPr>
-              <w:jc w:val="center"/>
-            </w:pPr>
-            <w:r>
-              <w:rPr>
-                <w:b/>
-                <w:bCs/>
-                <w:color w:val="C00000"/>
-                <w:sz w:val="20"/>
-                <w:szCs w:val="20"/>
-              </w:rPr>
-              <w:t>[ INSERTAR CAPTURA DE PANTALLA ]</w:t>
-            </w:r>
-          </w:p>
-          <w:p>
-            <w:pPr>
-              <w:jc w:val="center"/>
-            </w:pPr>
-            <w:r>
-              <w:rPr>
-                <w:color w:val="7F7F7F"/>
-                <w:sz w:val="18"/>
-                <w:szCs w:val="18"/>
-              </w:rPr>
-              <w:t>Celda 3.10: listado de offsets/, commits/, state/ y salida del reinicio (batchId y startOffset).</w:t>
-            </w:r>
-          </w:p>
-          <w:p>
-            <w:pPr>
-              <w:jc w:val="center"/>
-            </w:pPr>
-            <w:r>
-              <w:rPr>
-                <w:i/>
-                <w:iCs/>
-                <w:color w:val="7F7F7F"/>
-                <w:sz w:val="16"/>
-                <w:szCs w:val="16"/>
-              </w:rPr>
-              <w:t>Pantalla completa, sin recortar: reloj de Windows (fecha y hora) y usuario/perfil visibles.</w:t>
-            </w:r>
-          </w:p>
-        </w:tc>
-      </w:tr>
-    </w:tbl>
     <w:p>
       <w:pPr>
-        <w:spacing w:after="160"/>
-      </w:pPr>
+        <w:spacing w:before="120" w:after="40"/>
+        <w:jc w:val="center"/>
+      </w:pPr>
+      <w:r>
+        <w:rPr>
+          <w:noProof/>
+        </w:rPr>
+        <w:drawing>
+          <wp:inline distT="0" distB="0" distL="0" distR="0">
+            <wp:extent cx="5715000" cy="3219450"/>
+            <wp:effectExtent l="0" t="0" r="0" b="0"/>
+            <wp:docPr id="6" name="s08_cap6.png" descr="Celda 3.10: listado de offsets/, commits/, state/ y salida del reinicio (batchId y startOffset)." title="Captura 6"/>
+            <wp:cNvGraphicFramePr>
+              <a:graphicFrameLocks xmlns:a="http://schemas.openxmlformats.org/drawingml/2006/main" noChangeAspect="1"/>
+            </wp:cNvGraphicFramePr>
+            <a:graphic xmlns:a="http://schemas.openxmlformats.org/drawingml/2006/main">
+              <a:graphicData uri="http://schemas.openxmlformats.org/drawingml/2006/picture">
+                <pic:pic xmlns:pic="http://schemas.openxmlformats.org/drawingml/2006/picture">
+                  <pic:nvPicPr>
+                    <pic:cNvPr id="0" name=""/>
+                    <pic:cNvPicPr>
+                      <a:picLocks noChangeAspect="1" noChangeArrowheads="1"/>
+                    </pic:cNvPicPr>
+                  </pic:nvPicPr>
+                  <pic:blipFill>
+                    <a:blip r:embed="rId12"/>
+                    <a:srcRect/>
+                    <a:stretch>
+                      <a:fillRect/>
+                    </a:stretch>
+                  </pic:blipFill>
+                  <pic:spPr bwMode="auto">
+                    <a:xfrm>
+                      <a:off x="0" y="0"/>
+                      <a:ext cx="5715000" cy="3219450"/>
+                    </a:xfrm>
+                    <a:prstGeom prst="rect">
+                      <a:avLst/>
+                    </a:prstGeom>
+                  </pic:spPr>
+                </pic:pic>
+              </a:graphicData>
+            </a:graphic>
+          </wp:inline>
+        </w:drawing>
+      </w:r>
     </w:p>
     <w:p>
       <w:pPr>
+        <w:spacing w:after="200"/>
+        <w:jc w:val="center"/>
+      </w:pPr>
+      <w:r>
+        <w:rPr>
+          <w:i/>
+          <w:iCs/>
+          <w:color w:val="595959"/>
+          <w:sz w:val="18"/>
+          <w:szCs w:val="18"/>
+        </w:rPr>
+        <w:t>Captura 6. Celda 3.10: listado de offsets/, commits/, state/ y salida del reinicio (batchId y startOffset). (pantalla completa: reloj de Windows y perfil de Chrome visibles).</w:t>
+      </w:r>
+    </w:p>
+    <w:p>
+      <w:pPr>
+        <w:spacing w:before="120" w:after="40"/>
+        <w:jc w:val="center"/>
+      </w:pPr>
+      <w:r>
+        <w:rPr>
+          <w:noProof/>
+        </w:rPr>
+        <w:drawing>
+          <wp:inline distT="0" distB="0" distL="0" distR="0">
+            <wp:extent cx="5715000" cy="3219450"/>
+            <wp:effectExtent l="0" t="0" r="0" b="0"/>
+            <wp:docPr id="7" name="s08_cap7.png" descr="Celda 3.10: listado de offsets/, commits/, state/ y salida del reinicio (batchId y startOffset)." title="Captura 7"/>
+            <wp:cNvGraphicFramePr>
+              <a:graphicFrameLocks xmlns:a="http://schemas.openxmlformats.org/drawingml/2006/main" noChangeAspect="1"/>
+            </wp:cNvGraphicFramePr>
+            <a:graphic xmlns:a="http://schemas.openxmlformats.org/drawingml/2006/main">
+              <a:graphicData uri="http://schemas.openxmlformats.org/drawingml/2006/picture">
+                <pic:pic xmlns:pic="http://schemas.openxmlformats.org/drawingml/2006/picture">
+                  <pic:nvPicPr>
+                    <pic:cNvPr id="0" name=""/>
+                    <pic:cNvPicPr>
+                      <a:picLocks noChangeAspect="1" noChangeArrowheads="1"/>
+                    </pic:cNvPicPr>
+                  </pic:nvPicPr>
+                  <pic:blipFill>
+                    <a:blip r:embed="rId13"/>
+                    <a:srcRect/>
+                    <a:stretch>
+                      <a:fillRect/>
+                    </a:stretch>
+                  </pic:blipFill>
+                  <pic:spPr bwMode="auto">
+                    <a:xfrm>
+                      <a:off x="0" y="0"/>
+                      <a:ext cx="5715000" cy="3219450"/>
+                    </a:xfrm>
+                    <a:prstGeom prst="rect">
+                      <a:avLst/>
+                    </a:prstGeom>
+                  </pic:spPr>
+                </pic:pic>
+              </a:graphicData>
+            </a:graphic>
+          </wp:inline>
+        </w:drawing>
+      </w:r>
+    </w:p>
+    <w:p>
+      <w:pPr>
+        <w:spacing w:after="200"/>
+        <w:jc w:val="center"/>
+      </w:pPr>
+      <w:r>
+        <w:rPr>
+          <w:i/>
+          <w:iCs/>
+          <w:color w:val="595959"/>
+          <w:sz w:val="18"/>
+          <w:szCs w:val="18"/>
+        </w:rPr>
+        <w:t>Captura 7. Celda 3.10: listado de offsets/, commits/, state/ y salida del reinicio (batchId y startOffset). (pantalla completa: reloj de Windows y perfil de Chrome visibles).</w:t>
+      </w:r>
+    </w:p>
+    <w:p>
+      <w:pPr>
         <w:pStyle w:val="Ttulo2"/>
       </w:pPr>
-      <w:bookmarkStart w:id="6" w:name="_Toc242893057"/>
+      <w:bookmarkStart w:id="6" w:name="_Toc242895053"/>
       <w:r>
         <w:t>2.4 Bloque 4 — Persistencia en Parquet</w:t>
       </w:r>
@@ -7244,96 +7189,76 @@
         <w:t xml:space="preserve"> registra qué archivos pertenecen a cada micro-lote confirmado.</w:t>
       </w:r>
     </w:p>
-    <w:tbl>
-      <w:tblPr>
-        <w:tblW w:w="9026" w:type="dxa"/>
-        <w:tblBorders>
-          <w:top w:val="single" w:sz="4" w:space="0" w:color="auto"/>
-          <w:left w:val="single" w:sz="4" w:space="0" w:color="auto"/>
-          <w:bottom w:val="single" w:sz="4" w:space="0" w:color="auto"/>
-          <w:right w:val="single" w:sz="4" w:space="0" w:color="auto"/>
-          <w:insideH w:val="single" w:sz="4" w:space="0" w:color="auto"/>
-          <w:insideV w:val="single" w:sz="4" w:space="0" w:color="auto"/>
-        </w:tblBorders>
-        <w:tblLook w:val="04A0" w:firstRow="1" w:lastRow="0" w:firstColumn="1" w:lastColumn="0" w:noHBand="0" w:noVBand="1"/>
-      </w:tblPr>
-      <w:tblGrid>
-        <w:gridCol w:w="9026"/>
-      </w:tblGrid>
-      <w:tr>
-        <w:tc>
-          <w:tcPr>
-            <w:tcW w:w="9026" w:type="dxa"/>
-            <w:tcBorders>
-              <w:top w:val="dashed" w:sz="8" w:space="0" w:color="C00000"/>
-              <w:left w:val="dashed" w:sz="8" w:space="0" w:color="C00000"/>
-              <w:bottom w:val="dashed" w:sz="8" w:space="0" w:color="C00000"/>
-              <w:right w:val="dashed" w:sz="8" w:space="0" w:color="C00000"/>
-            </w:tcBorders>
-            <w:shd w:val="clear" w:color="auto" w:fill="FFF5F5"/>
-            <w:tcMar>
-              <w:top w:w="200" w:type="dxa"/>
-              <w:left w:w="200" w:type="dxa"/>
-              <w:bottom w:w="200" w:type="dxa"/>
-              <w:right w:w="200" w:type="dxa"/>
-            </w:tcMar>
-          </w:tcPr>
-          <w:p>
-            <w:pPr>
-              <w:jc w:val="center"/>
-            </w:pPr>
-            <w:r>
-              <w:rPr>
-                <w:b/>
-                <w:bCs/>
-                <w:color w:val="C00000"/>
-                <w:sz w:val="20"/>
-                <w:szCs w:val="20"/>
-              </w:rPr>
-              <w:t>[ INSERTAR CAPTURA DE PANTALLA ]</w:t>
-            </w:r>
-          </w:p>
-          <w:p>
-            <w:pPr>
-              <w:jc w:val="center"/>
-            </w:pPr>
-            <w:r>
-              <w:rPr>
-                <w:color w:val="7F7F7F"/>
-                <w:sz w:val="18"/>
-                <w:szCs w:val="18"/>
-              </w:rPr>
-              <w:t>Celda 3.6: 'CORRIDA 1 -&gt; …' y 'CORRIDA 2 -&gt; …' con '¿acumula en vez de sobreescribir? True'.</w:t>
-            </w:r>
-          </w:p>
-          <w:p>
-            <w:pPr>
-              <w:jc w:val="center"/>
-            </w:pPr>
-            <w:r>
-              <w:rPr>
-                <w:i/>
-                <w:iCs/>
-                <w:color w:val="7F7F7F"/>
-                <w:sz w:val="16"/>
-                <w:szCs w:val="16"/>
-              </w:rPr>
-              <w:t>Pantalla completa, sin recortar: reloj de Windows (fecha y hora) y usuario/perfil visibles.</w:t>
-            </w:r>
-          </w:p>
-        </w:tc>
-      </w:tr>
-    </w:tbl>
     <w:p>
       <w:pPr>
-        <w:spacing w:after="160"/>
-      </w:pPr>
+        <w:spacing w:before="120" w:after="40"/>
+        <w:jc w:val="center"/>
+      </w:pPr>
+      <w:r>
+        <w:rPr>
+          <w:noProof/>
+        </w:rPr>
+        <w:drawing>
+          <wp:inline distT="0" distB="0" distL="0" distR="0">
+            <wp:extent cx="5715000" cy="3219450"/>
+            <wp:effectExtent l="0" t="0" r="0" b="0"/>
+            <wp:docPr id="8" name="s08_cap8.png" descr="Celda 3.6: 'CORRIDA 1 -&gt; …' y 'CORRIDA 2 -&gt; …' con '¿acumula en vez de sobreescribir? True'." title="Captura 8"/>
+            <wp:cNvGraphicFramePr>
+              <a:graphicFrameLocks xmlns:a="http://schemas.openxmlformats.org/drawingml/2006/main" noChangeAspect="1"/>
+            </wp:cNvGraphicFramePr>
+            <a:graphic xmlns:a="http://schemas.openxmlformats.org/drawingml/2006/main">
+              <a:graphicData uri="http://schemas.openxmlformats.org/drawingml/2006/picture">
+                <pic:pic xmlns:pic="http://schemas.openxmlformats.org/drawingml/2006/picture">
+                  <pic:nvPicPr>
+                    <pic:cNvPr id="0" name=""/>
+                    <pic:cNvPicPr>
+                      <a:picLocks noChangeAspect="1" noChangeArrowheads="1"/>
+                    </pic:cNvPicPr>
+                  </pic:nvPicPr>
+                  <pic:blipFill>
+                    <a:blip r:embed="rId14"/>
+                    <a:srcRect/>
+                    <a:stretch>
+                      <a:fillRect/>
+                    </a:stretch>
+                  </pic:blipFill>
+                  <pic:spPr bwMode="auto">
+                    <a:xfrm>
+                      <a:off x="0" y="0"/>
+                      <a:ext cx="5715000" cy="3219450"/>
+                    </a:xfrm>
+                    <a:prstGeom prst="rect">
+                      <a:avLst/>
+                    </a:prstGeom>
+                  </pic:spPr>
+                </pic:pic>
+              </a:graphicData>
+            </a:graphic>
+          </wp:inline>
+        </w:drawing>
+      </w:r>
     </w:p>
     <w:p>
       <w:pPr>
+        <w:spacing w:after="200"/>
+        <w:jc w:val="center"/>
+      </w:pPr>
+      <w:r>
+        <w:rPr>
+          <w:i/>
+          <w:iCs/>
+          <w:color w:val="595959"/>
+          <w:sz w:val="18"/>
+          <w:szCs w:val="18"/>
+        </w:rPr>
+        <w:t>Captura 8. Celda 3.6: 'CORRIDA 1 -&gt; …' y 'CORRIDA 2 -&gt; …' con '¿acumula en vez de sobreescribir? True'. (pantalla completa: reloj de Windows y perfil de Chrome visibles).</w:t>
+      </w:r>
+    </w:p>
+    <w:p>
+      <w:pPr>
         <w:pStyle w:val="Ttulo1"/>
       </w:pPr>
-      <w:bookmarkStart w:id="7" w:name="_Toc242893058"/>
+      <w:bookmarkStart w:id="7" w:name="_Toc242895054"/>
       <w:r>
         <w:t>3. Error o hallazgo técnico</w:t>
       </w:r>
@@ -8486,7 +8411,7 @@
       <w:pPr>
         <w:pStyle w:val="Ttulo1"/>
       </w:pPr>
-      <w:bookmarkStart w:id="8" w:name="_Toc242893059"/>
+      <w:bookmarkStart w:id="8" w:name="_Toc242895055"/>
       <w:r>
         <w:t>4. Reflexión técnica</w:t>
       </w:r>
@@ -8517,7 +8442,7 @@
       <w:pPr>
         <w:pStyle w:val="Ttulo1"/>
       </w:pPr>
-      <w:bookmarkStart w:id="9" w:name="_Toc242893060"/>
+      <w:bookmarkStart w:id="9" w:name="_Toc242895056"/>
       <w:r>
         <w:t>5. Respuestas a las preguntas de defensa</w:t>
       </w:r>
@@ -8741,7 +8666,7 @@
       <w:pPr>
         <w:pStyle w:val="Ttulo1"/>
       </w:pPr>
-      <w:bookmarkStart w:id="10" w:name="_Toc242893061"/>
+      <w:bookmarkStart w:id="10" w:name="_Toc242895057"/>
       <w:r>
         <w:t>6. Autoevaluación con la rúbrica</w:t>
       </w:r>
@@ -9345,14 +9270,14 @@
           <w:sz w:val="18"/>
           <w:szCs w:val="18"/>
         </w:rPr>
-        <w:t>Tabla 6. Autoevaluación (nota esperada: 20/20, sujeta a insertar las capturas)</w:t>
+        <w:t>Tabla 6. Autoevaluación (nota esperada: 20/20)</w:t>
       </w:r>
     </w:p>
     <w:p>
       <w:pPr>
         <w:pStyle w:val="Ttulo2"/>
       </w:pPr>
-      <w:bookmarkStart w:id="11" w:name="_Toc242893062"/>
+      <w:bookmarkStart w:id="11" w:name="_Toc242895058"/>
       <w:r>
         <w:t>Criterios mínimos de aceptación</w:t>
       </w:r>
@@ -9827,7 +9752,7 @@
                 <w:sz w:val="19"/>
                 <w:szCs w:val="19"/>
               </w:rPr>
-              <w:t>Pendiente: insertar en los recuadros rojos</w:t>
+              <w:t>Cumple (8 capturas de pantalla completa)</w:t>
             </w:r>
           </w:p>
         </w:tc>
@@ -9883,7 +9808,7 @@
                 <w:sz w:val="19"/>
                 <w:szCs w:val="19"/>
               </w:rPr>
-              <w:t>Pendiente: hacer commit/push el 2026-10-14</w:t>
+              <w:t>Cumple (commits del 2026-10-14)</w:t>
             </w:r>
           </w:p>
         </w:tc>
@@ -10005,7 +9930,7 @@
       <w:pPr>
         <w:pStyle w:val="Ttulo1"/>
       </w:pPr>
-      <w:bookmarkStart w:id="12" w:name="_Toc242893063"/>
+      <w:bookmarkStart w:id="12" w:name="_Toc242895059"/>
       <w:r>
         <w:t>Bibliografía</w:t>
       </w:r>
@@ -10051,7 +9976,7 @@
       </w:r>
     </w:p>
     <w:sectPr>
-      <w:footerReference w:type="default" r:id="rId7"/>
+      <w:footerReference w:type="default" r:id="rId15"/>
       <w:pgSz w:w="11906" w:h="16838"/>
       <w:pgMar w:top="1440" w:right="1440" w:bottom="1440" w:left="1440" w:header="708" w:footer="708" w:gutter="0"/>
       <w:cols w:space="720"/>
@@ -10161,10 +10086,10 @@
 <file path=word/numbering.xml><?xml version="1.0" encoding="utf-8"?>
 <w:numbering xmlns:wpc="http://schemas.microsoft.com/office/word/2010/wordprocessingCanvas" xmlns:cx="http://schemas.microsoft.com/office/drawing/2014/chartex" xmlns:cx1="http://schemas.microsoft.com/office/drawing/2015/9/8/chartex" xmlns:cx2="http://schemas.microsoft.com/office/drawing/2015/10/21/chartex" xmlns:cx3="http://schemas.microsoft.com/office/drawing/2016/5/9/chartex" xmlns:cx4="http://schemas.microsoft.com/office/drawing/2016/5/10/chartex" xmlns:cx5="http://schemas.microsoft.com/office/drawing/2016/5/11/chartex" xmlns:cx6="http://schemas.microsoft.com/office/drawing/2016/5/12/chartex" xmlns:cx7="http://schemas.microsoft.com/office/drawing/2016/5/13/chartex" xmlns:cx8="http://schemas.microsoft.com/office/drawing/2016/5/14/chartex" xmlns:mc="http://schemas.openxmlformats.org/markup-compatibility/2006" xmlns:aink="http://schemas.microsoft.com/office/drawing/2016/ink" xmlns:am3d="http://schemas.microsoft.com/office/drawing/2017/model3d" xmlns:o="urn:schemas-microsoft-com:office:office" xmlns:oel="http://schemas.microsoft.com/office/2019/extlst" xmlns:r="http://schemas.openxmlformats.org/officeDocument/2006/relationships" xmlns:m="http://schemas.openxmlformats.org/officeDocument/2006/math" xmlns:v="urn:schemas-microsoft-com:vml" xmlns:wp14="http://schemas.microsoft.com/office/word/2010/wordprocessingDrawing" xmlns:wp="http://schemas.openxmlformats.org/drawingml/2006/wordprocessingDrawing" xmlns:w10="urn:schemas-microsoft-com:office:word" xmlns:w="http://schemas.openxmlformats.org/wordprocessingml/2006/main" xmlns:w14="http://schemas.microsoft.com/office/word/2010/wordml" xmlns:w15="http://schemas.microsoft.com/office/word/2012/wordml" xmlns:w16cex="http://schemas.microsoft.com/office/word/2018/wordml/cex" xmlns:w16cid="http://schemas.microsoft.com/office/word/2016/wordml/cid" xmlns:w16="http://schemas.microsoft.com/office/word/2018/wordml" xmlns:w16du="http://schemas.microsoft.com/office/word/2023/wordml/word16du" xmlns:w16sdtdh="http://schemas.microsoft.com/office/word/2020/wordml/sdtdatahash" xmlns:w16sdtfl="http://schemas.microsoft.com/office/word/2024/wordml/sdtformatlock" xmlns:w16se="http://schemas.microsoft.com/office/word/2015/wordml/symex" xmlns:wpg="http://schemas.microsoft.com/office/word/2010/wordprocessingGroup" xmlns:wpi="http://schemas.microsoft.com/office/word/2010/wordprocessingInk" xmlns:wne="http://schemas.microsoft.com/office/word/2006/wordml" xmlns:wps="http://schemas.microsoft.com/office/word/2010/wordprocessingShape" mc:Ignorable="w14 w15 w16se w16cid w16 w16cex w16sdtdh w16sdtfl w16du wp14">
   <w:abstractNum w:abstractNumId="0" w15:restartNumberingAfterBreak="0">
-    <w:nsid w:val="0D1519A1"/>
+    <w:nsid w:val="13E14DC8"/>
     <w:multiLevelType w:val="hybridMultilevel"/>
-    <w:tmpl w:val="E4F294A0"/>
-    <w:lvl w:ilvl="0" w:tplc="284073D2">
+    <w:tmpl w:val="6E2AA27E"/>
+    <w:lvl w:ilvl="0" w:tplc="4BA8D1EC" w:tentative="1">
       <w:start w:val="1"/>
       <w:numFmt w:val="decimal"/>
       <w:lvlText w:val="%1."/>
@@ -10173,52 +10098,52 @@
         <w:ind w:left="720" w:hanging="360"/>
       </w:pPr>
     </w:lvl>
-    <w:lvl w:ilvl="1" w:tplc="9DA2CEE4">
+    <w:lvl w:ilvl="1" w:tplc="E29C23D8">
       <w:numFmt w:val="decimal"/>
       <w:lvlText w:val=""/>
       <w:lvlJc w:val="left"/>
     </w:lvl>
-    <w:lvl w:ilvl="2" w:tplc="8CDC6334">
+    <w:lvl w:ilvl="2" w:tplc="8A508FFA">
       <w:numFmt w:val="decimal"/>
       <w:lvlText w:val=""/>
       <w:lvlJc w:val="left"/>
     </w:lvl>
-    <w:lvl w:ilvl="3" w:tplc="3BD26838">
+    <w:lvl w:ilvl="3" w:tplc="F21CB98C">
       <w:numFmt w:val="decimal"/>
       <w:lvlText w:val=""/>
       <w:lvlJc w:val="left"/>
     </w:lvl>
-    <w:lvl w:ilvl="4" w:tplc="B5ECA39A">
+    <w:lvl w:ilvl="4" w:tplc="A4C80746">
       <w:numFmt w:val="decimal"/>
       <w:lvlText w:val=""/>
       <w:lvlJc w:val="left"/>
     </w:lvl>
-    <w:lvl w:ilvl="5" w:tplc="FA54ED3A">
+    <w:lvl w:ilvl="5" w:tplc="7F36D4BE">
       <w:numFmt w:val="decimal"/>
       <w:lvlText w:val=""/>
       <w:lvlJc w:val="left"/>
     </w:lvl>
-    <w:lvl w:ilvl="6" w:tplc="5F8AAA8E">
+    <w:lvl w:ilvl="6" w:tplc="07523EBC">
       <w:numFmt w:val="decimal"/>
       <w:lvlText w:val=""/>
       <w:lvlJc w:val="left"/>
     </w:lvl>
-    <w:lvl w:ilvl="7" w:tplc="A9140132">
+    <w:lvl w:ilvl="7" w:tplc="06B49ECA">
       <w:numFmt w:val="decimal"/>
       <w:lvlText w:val=""/>
       <w:lvlJc w:val="left"/>
     </w:lvl>
-    <w:lvl w:ilvl="8" w:tplc="244831C6">
+    <w:lvl w:ilvl="8" w:tplc="1BA4D6DE">
       <w:numFmt w:val="decimal"/>
       <w:lvlText w:val=""/>
       <w:lvlJc w:val="left"/>
     </w:lvl>
   </w:abstractNum>
   <w:abstractNum w:abstractNumId="1" w15:restartNumberingAfterBreak="0">
-    <w:nsid w:val="1E280988"/>
+    <w:nsid w:val="40A71969"/>
     <w:multiLevelType w:val="hybridMultilevel"/>
-    <w:tmpl w:val="6C185C80"/>
-    <w:lvl w:ilvl="0" w:tplc="F828E19A" w:tentative="1">
+    <w:tmpl w:val="EE82B540"/>
+    <w:lvl w:ilvl="0" w:tplc="DB40CBC2" w:tentative="1">
       <w:start w:val="1"/>
       <w:numFmt w:val="bullet"/>
       <w:lvlText w:val="●"/>
@@ -10227,7 +10152,7 @@
         <w:ind w:left="720" w:hanging="360"/>
       </w:pPr>
     </w:lvl>
-    <w:lvl w:ilvl="1" w:tplc="8758A6A4" w:tentative="1">
+    <w:lvl w:ilvl="1" w:tplc="84FC4B8E" w:tentative="1">
       <w:start w:val="1"/>
       <w:numFmt w:val="bullet"/>
       <w:lvlText w:val="○"/>
@@ -10236,7 +10161,7 @@
         <w:ind w:left="1440" w:hanging="360"/>
       </w:pPr>
     </w:lvl>
-    <w:lvl w:ilvl="2" w:tplc="59E07A5C" w:tentative="1">
+    <w:lvl w:ilvl="2" w:tplc="FBDCC4D0" w:tentative="1">
       <w:start w:val="1"/>
       <w:numFmt w:val="bullet"/>
       <w:lvlText w:val="■"/>
@@ -10245,7 +10170,7 @@
         <w:ind w:left="2160" w:hanging="360"/>
       </w:pPr>
     </w:lvl>
-    <w:lvl w:ilvl="3" w:tplc="9F949F66" w:tentative="1">
+    <w:lvl w:ilvl="3" w:tplc="12B4D298" w:tentative="1">
       <w:start w:val="1"/>
       <w:numFmt w:val="bullet"/>
       <w:lvlText w:val="●"/>
@@ -10254,7 +10179,7 @@
         <w:ind w:left="2880" w:hanging="360"/>
       </w:pPr>
     </w:lvl>
-    <w:lvl w:ilvl="4" w:tplc="9718E6E8" w:tentative="1">
+    <w:lvl w:ilvl="4" w:tplc="93803718" w:tentative="1">
       <w:start w:val="1"/>
       <w:numFmt w:val="bullet"/>
       <w:lvlText w:val="○"/>
@@ -10263,7 +10188,7 @@
         <w:ind w:left="3600" w:hanging="360"/>
       </w:pPr>
     </w:lvl>
-    <w:lvl w:ilvl="5" w:tplc="028E759A" w:tentative="1">
+    <w:lvl w:ilvl="5" w:tplc="DE1A1306" w:tentative="1">
       <w:start w:val="1"/>
       <w:numFmt w:val="bullet"/>
       <w:lvlText w:val="■"/>
@@ -10272,7 +10197,7 @@
         <w:ind w:left="4320" w:hanging="360"/>
       </w:pPr>
     </w:lvl>
-    <w:lvl w:ilvl="6" w:tplc="2978618E" w:tentative="1">
+    <w:lvl w:ilvl="6" w:tplc="0AA83854" w:tentative="1">
       <w:start w:val="1"/>
       <w:numFmt w:val="bullet"/>
       <w:lvlText w:val="●"/>
@@ -10281,7 +10206,7 @@
         <w:ind w:left="5040" w:hanging="360"/>
       </w:pPr>
     </w:lvl>
-    <w:lvl w:ilvl="7" w:tplc="1838840E" w:tentative="1">
+    <w:lvl w:ilvl="7" w:tplc="544C7B24" w:tentative="1">
       <w:start w:val="1"/>
       <w:numFmt w:val="bullet"/>
       <w:lvlText w:val="●"/>
@@ -10290,7 +10215,7 @@
         <w:ind w:left="5760" w:hanging="360"/>
       </w:pPr>
     </w:lvl>
-    <w:lvl w:ilvl="8" w:tplc="7396B72C" w:tentative="1">
+    <w:lvl w:ilvl="8" w:tplc="97C881C0" w:tentative="1">
       <w:start w:val="1"/>
       <w:numFmt w:val="bullet"/>
       <w:lvlText w:val="●"/>
@@ -10301,121 +10226,121 @@
     </w:lvl>
   </w:abstractNum>
   <w:abstractNum w:abstractNumId="2" w15:restartNumberingAfterBreak="0">
-    <w:nsid w:val="69C14C5E"/>
+    <w:nsid w:val="65AF2D1B"/>
     <w:multiLevelType w:val="hybridMultilevel"/>
-    <w:tmpl w:val="DF2EA100"/>
-    <w:lvl w:ilvl="0" w:tplc="1C80D02C" w:tentative="1">
+    <w:tmpl w:val="1EEEE552"/>
+    <w:lvl w:ilvl="0" w:tplc="3C7A9F20" w:tentative="1">
       <w:start w:val="1"/>
-      <w:numFmt w:val="decimal"/>
-      <w:lvlText w:val="%1."/>
+      <w:numFmt w:val="bullet"/>
+      <w:lvlText w:val="•"/>
       <w:lvlJc w:val="left"/>
       <w:pPr>
         <w:ind w:left="720" w:hanging="360"/>
       </w:pPr>
     </w:lvl>
-    <w:lvl w:ilvl="1" w:tplc="E6A043E4">
+    <w:lvl w:ilvl="1" w:tplc="2C3EA646">
       <w:numFmt w:val="decimal"/>
       <w:lvlText w:val=""/>
       <w:lvlJc w:val="left"/>
     </w:lvl>
-    <w:lvl w:ilvl="2" w:tplc="0F1059A0">
+    <w:lvl w:ilvl="2" w:tplc="6A16626E">
       <w:numFmt w:val="decimal"/>
       <w:lvlText w:val=""/>
       <w:lvlJc w:val="left"/>
     </w:lvl>
-    <w:lvl w:ilvl="3" w:tplc="A4667A36">
+    <w:lvl w:ilvl="3" w:tplc="B5306A18">
       <w:numFmt w:val="decimal"/>
       <w:lvlText w:val=""/>
       <w:lvlJc w:val="left"/>
     </w:lvl>
-    <w:lvl w:ilvl="4" w:tplc="DEDE90FC">
+    <w:lvl w:ilvl="4" w:tplc="8BE68942">
       <w:numFmt w:val="decimal"/>
       <w:lvlText w:val=""/>
       <w:lvlJc w:val="left"/>
     </w:lvl>
-    <w:lvl w:ilvl="5" w:tplc="8C3A16F2">
+    <w:lvl w:ilvl="5" w:tplc="2648E464">
       <w:numFmt w:val="decimal"/>
       <w:lvlText w:val=""/>
       <w:lvlJc w:val="left"/>
     </w:lvl>
-    <w:lvl w:ilvl="6" w:tplc="8EBC622E">
+    <w:lvl w:ilvl="6" w:tplc="7AEE58B8">
       <w:numFmt w:val="decimal"/>
       <w:lvlText w:val=""/>
       <w:lvlJc w:val="left"/>
     </w:lvl>
-    <w:lvl w:ilvl="7" w:tplc="17B0070E">
+    <w:lvl w:ilvl="7" w:tplc="EDFEEC66">
       <w:numFmt w:val="decimal"/>
       <w:lvlText w:val=""/>
       <w:lvlJc w:val="left"/>
     </w:lvl>
-    <w:lvl w:ilvl="8" w:tplc="20D4D804">
+    <w:lvl w:ilvl="8" w:tplc="8610826C">
       <w:numFmt w:val="decimal"/>
       <w:lvlText w:val=""/>
       <w:lvlJc w:val="left"/>
     </w:lvl>
   </w:abstractNum>
   <w:abstractNum w:abstractNumId="3" w15:restartNumberingAfterBreak="0">
-    <w:nsid w:val="6D76110F"/>
+    <w:nsid w:val="71E70335"/>
     <w:multiLevelType w:val="hybridMultilevel"/>
-    <w:tmpl w:val="210AC5F6"/>
-    <w:lvl w:ilvl="0" w:tplc="E6387BA0" w:tentative="1">
+    <w:tmpl w:val="55F27510"/>
+    <w:lvl w:ilvl="0" w:tplc="61CEB666">
       <w:start w:val="1"/>
-      <w:numFmt w:val="bullet"/>
-      <w:lvlText w:val="•"/>
+      <w:numFmt w:val="decimal"/>
+      <w:lvlText w:val="%1."/>
       <w:lvlJc w:val="left"/>
       <w:pPr>
         <w:ind w:left="720" w:hanging="360"/>
       </w:pPr>
     </w:lvl>
-    <w:lvl w:ilvl="1" w:tplc="06BEFDDC">
+    <w:lvl w:ilvl="1" w:tplc="E24AB276">
       <w:numFmt w:val="decimal"/>
       <w:lvlText w:val=""/>
       <w:lvlJc w:val="left"/>
     </w:lvl>
-    <w:lvl w:ilvl="2" w:tplc="7A2666FC">
+    <w:lvl w:ilvl="2" w:tplc="C53C0266">
       <w:numFmt w:val="decimal"/>
       <w:lvlText w:val=""/>
       <w:lvlJc w:val="left"/>
     </w:lvl>
-    <w:lvl w:ilvl="3" w:tplc="27E856CC">
+    <w:lvl w:ilvl="3" w:tplc="49B87A72">
       <w:numFmt w:val="decimal"/>
       <w:lvlText w:val=""/>
       <w:lvlJc w:val="left"/>
     </w:lvl>
-    <w:lvl w:ilvl="4" w:tplc="657499C8">
+    <w:lvl w:ilvl="4" w:tplc="EA5A3DBA">
       <w:numFmt w:val="decimal"/>
       <w:lvlText w:val=""/>
       <w:lvlJc w:val="left"/>
     </w:lvl>
-    <w:lvl w:ilvl="5" w:tplc="28CEB442">
+    <w:lvl w:ilvl="5" w:tplc="861C5850">
       <w:numFmt w:val="decimal"/>
       <w:lvlText w:val=""/>
       <w:lvlJc w:val="left"/>
     </w:lvl>
-    <w:lvl w:ilvl="6" w:tplc="C62C00C0">
+    <w:lvl w:ilvl="6" w:tplc="818C5750">
       <w:numFmt w:val="decimal"/>
       <w:lvlText w:val=""/>
       <w:lvlJc w:val="left"/>
     </w:lvl>
-    <w:lvl w:ilvl="7" w:tplc="0BD8A53A">
+    <w:lvl w:ilvl="7" w:tplc="11DED560">
       <w:numFmt w:val="decimal"/>
       <w:lvlText w:val=""/>
       <w:lvlJc w:val="left"/>
     </w:lvl>
-    <w:lvl w:ilvl="8" w:tplc="4992DEC6">
+    <w:lvl w:ilvl="8" w:tplc="4F3627AC">
       <w:numFmt w:val="decimal"/>
       <w:lvlText w:val=""/>
       <w:lvlJc w:val="left"/>
     </w:lvl>
   </w:abstractNum>
-  <w:num w:numId="1" w16cid:durableId="1349911379">
+  <w:num w:numId="1" w16cid:durableId="1652177703">
     <w:abstractNumId w:val="1"/>
     <w:lvlOverride w:ilvl="0">
       <w:startOverride w:val="1"/>
     </w:lvlOverride>
   </w:num>
-  <w:num w:numId="2" w16cid:durableId="174001745">
-    <w:abstractNumId w:val="0"/>
+  <w:num w:numId="2" w16cid:durableId="1957516945">
+    <w:abstractNumId w:val="3"/>
     <w:lvlOverride w:ilvl="0">
       <w:startOverride w:val="1"/>
     </w:lvlOverride>
@@ -11054,7 +10979,7 @@
     <w:autoRedefine/>
     <w:uiPriority w:val="39"/>
     <w:unhideWhenUsed/>
-    <w:rsid w:val="004C64DA"/>
+    <w:rsid w:val="000F075C"/>
     <w:pPr>
       <w:spacing w:after="100"/>
     </w:pPr>
@@ -11066,7 +10991,7 @@
     <w:autoRedefine/>
     <w:uiPriority w:val="39"/>
     <w:unhideWhenUsed/>
-    <w:rsid w:val="004C64DA"/>
+    <w:rsid w:val="000F075C"/>
     <w:pPr>
       <w:spacing w:after="100"/>
       <w:ind w:left="220"/>

</xml_diff>